<commit_message>
Deploying to gh-pages from @ d-morrison/rme@b5421765e4b2fde97b9699f7d1e0c7b2f0a6a56a 🚀
</commit_message>
<xml_diff>
--- a/chapters/data-handout.docx
+++ b/chapters/data-handout.docx
@@ -8121,7 +8121,13 @@
               <w:t xml:space="preserve"> </w:t>
             </w:r>
             <w:r>
-              <w:t xml:space="preserve">is a random variable whose possible values are some subset of the non-negative integers; that is, a random variable</w:t>
+              <w:t xml:space="preserve">is a random variable whose possible values are some subset of the non-negative integers;</w:t>
+            </w:r>
+            <w:r>
+              <w:t xml:space="preserve"> </w:t>
+            </w:r>
+            <w:r>
+              <w:t xml:space="preserve">specifically, a random variable</w:t>
             </w:r>
             <w:r>
               <w:t xml:space="preserve"> </w:t>

</xml_diff>